<commit_message>
Fix community PDF typography and pagination
</commit_message>
<xml_diff>
--- a/resources/letter-to-parents-editable.docx
+++ b/resources/letter-to-parents-editable.docx
@@ -39,28 +39,6 @@
         <w:t xml:space="preserve"> A two-semester public course</w:t>
       </w:r>
     </w:p>
-    <w:bookmarkStart w:id="9" w:name="致家长的一封信"/>
-    <w:p>
-      <w:pPr>
-        <w:pStyle w:val="Heading1"/>
-      </w:pPr>
-      <w:r>
-        <w:rPr>
-          <w:rFonts w:hint="eastAsia"/>
-        </w:rPr>
-        <w:t xml:space="preserve">致家长的一封信</w:t>
-      </w:r>
-    </w:p>
-    <w:bookmarkEnd w:id="9"/>
-    <w:bookmarkStart w:id="48" w:name="a-letter-to-parents"/>
-    <w:p>
-      <w:pPr>
-        <w:pStyle w:val="Heading1"/>
-      </w:pPr>
-      <w:r>
-        <w:t xml:space="preserve">A Letter to Parents</w:t>
-      </w:r>
-    </w:p>
     <w:p>
       <w:pPr>
         <w:pStyle w:val="FirstParagraph"/>
@@ -120,7 +98,7 @@
         </w:pict>
       </w:r>
     </w:p>
-    <w:bookmarkStart w:id="10" w:name="尊敬的家长"/>
+    <w:bookmarkStart w:id="9" w:name="尊敬的家长"/>
     <w:p>
       <w:pPr>
         <w:pStyle w:val="Heading2"/>
@@ -132,11 +110,9 @@
         <w:t xml:space="preserve">尊敬的家长：</w:t>
       </w:r>
     </w:p>
-    <w:bookmarkEnd w:id="10"/>
-    <w:bookmarkStart w:id="11" w:name="dear-parents"/>
-    <w:p>
-      <w:pPr>
-        <w:pStyle w:val="Heading2"/>
+    <w:p>
+      <w:pPr>
+        <w:pStyle w:val="FirstParagraph"/>
       </w:pPr>
       <w:r>
         <w:t xml:space="preserve">Dear Parents,</w:t>
@@ -144,7 +120,7 @@
     </w:p>
     <w:p>
       <w:pPr>
-        <w:pStyle w:val="FirstParagraph"/>
+        <w:pStyle w:val="BodyText"/>
       </w:pPr>
       <w:r>
         <w:rPr>
@@ -207,8 +183,8 @@
         </w:pict>
       </w:r>
     </w:p>
-    <w:bookmarkEnd w:id="11"/>
-    <w:bookmarkStart w:id="12" w:name="一这是一门什么课为什么要有它"/>
+    <w:bookmarkEnd w:id="9"/>
+    <w:bookmarkStart w:id="10" w:name="一这是一门什么课为什么要有它"/>
     <w:p>
       <w:pPr>
         <w:pStyle w:val="Heading2"/>
@@ -220,11 +196,9 @@
         <w:t xml:space="preserve">一、这是一门什么课，为什么要有它</w:t>
       </w:r>
     </w:p>
-    <w:bookmarkEnd w:id="12"/>
-    <w:bookmarkStart w:id="13" w:name="what-this-course-is-and-why-it-exists"/>
-    <w:p>
-      <w:pPr>
-        <w:pStyle w:val="Heading2"/>
+    <w:p>
+      <w:pPr>
+        <w:pStyle w:val="FirstParagraph"/>
       </w:pPr>
       <w:r>
         <w:t xml:space="preserve">1. What this course is, and why it exists</w:t>
@@ -232,7 +206,7 @@
     </w:p>
     <w:p>
       <w:pPr>
-        <w:pStyle w:val="FirstParagraph"/>
+        <w:pStyle w:val="BodyText"/>
       </w:pPr>
       <w:r>
         <w:rPr>
@@ -467,8 +441,8 @@
         </w:pict>
       </w:r>
     </w:p>
-    <w:bookmarkEnd w:id="13"/>
-    <w:bookmarkStart w:id="14" w:name="二这门课怎么运行"/>
+    <w:bookmarkEnd w:id="10"/>
+    <w:bookmarkStart w:id="11" w:name="二这门课怎么运行"/>
     <w:p>
       <w:pPr>
         <w:pStyle w:val="Heading2"/>
@@ -480,11 +454,9 @@
         <w:t xml:space="preserve">二、这门课怎么运行</w:t>
       </w:r>
     </w:p>
-    <w:bookmarkEnd w:id="14"/>
-    <w:bookmarkStart w:id="15" w:name="how-the-course-runs"/>
-    <w:p>
-      <w:pPr>
-        <w:pStyle w:val="Heading2"/>
+    <w:p>
+      <w:pPr>
+        <w:pStyle w:val="FirstParagraph"/>
       </w:pPr>
       <w:r>
         <w:t xml:space="preserve">2. How the course runs</w:t>
@@ -1020,8 +992,8 @@
         </w:pict>
       </w:r>
     </w:p>
-    <w:bookmarkEnd w:id="15"/>
-    <w:bookmarkStart w:id="16" w:name="三孩子的一周具体是什么样"/>
+    <w:bookmarkEnd w:id="11"/>
+    <w:bookmarkStart w:id="12" w:name="三孩子的一周具体是什么样"/>
     <w:p>
       <w:pPr>
         <w:pStyle w:val="Heading2"/>
@@ -1033,11 +1005,9 @@
         <w:t xml:space="preserve">三、孩子的一周，具体是什么样</w:t>
       </w:r>
     </w:p>
-    <w:bookmarkEnd w:id="16"/>
-    <w:bookmarkStart w:id="17" w:name="what-a-week-actually-looks-like"/>
-    <w:p>
-      <w:pPr>
-        <w:pStyle w:val="Heading2"/>
+    <w:p>
+      <w:pPr>
+        <w:pStyle w:val="FirstParagraph"/>
       </w:pPr>
       <w:r>
         <w:t xml:space="preserve">3. What a week actually looks like</w:t>
@@ -1045,7 +1015,7 @@
     </w:p>
     <w:p>
       <w:pPr>
-        <w:pStyle w:val="FirstParagraph"/>
+        <w:pStyle w:val="BodyText"/>
       </w:pPr>
       <w:r>
         <w:rPr>
@@ -1877,8 +1847,8 @@
         </w:pict>
       </w:r>
     </w:p>
-    <w:bookmarkEnd w:id="17"/>
-    <w:bookmarkStart w:id="18" w:name="四作品怎么评放在哪里"/>
+    <w:bookmarkEnd w:id="12"/>
+    <w:bookmarkStart w:id="13" w:name="四作品怎么评放在哪里"/>
     <w:p>
       <w:pPr>
         <w:pStyle w:val="Heading2"/>
@@ -1890,11 +1860,9 @@
         <w:t xml:space="preserve">四、作品怎么评，放在哪里</w:t>
       </w:r>
     </w:p>
-    <w:bookmarkEnd w:id="18"/>
-    <w:bookmarkStart w:id="19" w:name="how-work-is-assessed-and-where-it-lives"/>
-    <w:p>
-      <w:pPr>
-        <w:pStyle w:val="Heading2"/>
+    <w:p>
+      <w:pPr>
+        <w:pStyle w:val="FirstParagraph"/>
       </w:pPr>
       <w:r>
         <w:t xml:space="preserve">4. How work is assessed, and where it lives</w:t>
@@ -1902,7 +1870,7 @@
     </w:p>
     <w:p>
       <w:pPr>
-        <w:pStyle w:val="FirstParagraph"/>
+        <w:pStyle w:val="BodyText"/>
       </w:pPr>
       <w:r>
         <w:rPr>
@@ -2391,8 +2359,8 @@
         </w:pict>
       </w:r>
     </w:p>
-    <w:bookmarkEnd w:id="19"/>
-    <w:bookmarkStart w:id="20" w:name="五隐私与安全我们做了哪些保护"/>
+    <w:bookmarkEnd w:id="13"/>
+    <w:bookmarkStart w:id="14" w:name="五隐私与安全我们做了哪些保护"/>
     <w:p>
       <w:pPr>
         <w:pStyle w:val="Heading2"/>
@@ -2404,11 +2372,9 @@
         <w:t xml:space="preserve">五、隐私与安全：我们做了哪些保护</w:t>
       </w:r>
     </w:p>
-    <w:bookmarkEnd w:id="20"/>
-    <w:bookmarkStart w:id="21" w:name="Xdbd6e168df960fb8c88f1bf8cef3ff52cf47821"/>
-    <w:p>
-      <w:pPr>
-        <w:pStyle w:val="Heading2"/>
+    <w:p>
+      <w:pPr>
+        <w:pStyle w:val="FirstParagraph"/>
       </w:pPr>
       <w:r>
         <w:t xml:space="preserve">5. Privacy and safety: what we have put in place</w:t>
@@ -2416,7 +2382,7 @@
     </w:p>
     <w:p>
       <w:pPr>
-        <w:pStyle w:val="FirstParagraph"/>
+        <w:pStyle w:val="BodyText"/>
       </w:pPr>
       <w:r>
         <w:rPr>
@@ -2821,8 +2787,8 @@
         </w:pict>
       </w:r>
     </w:p>
-    <w:bookmarkEnd w:id="21"/>
-    <w:bookmarkStart w:id="22" w:name="六家长可以怎样帮忙"/>
+    <w:bookmarkEnd w:id="14"/>
+    <w:bookmarkStart w:id="23" w:name="六家长可以怎样帮忙"/>
     <w:p>
       <w:pPr>
         <w:pStyle w:val="Heading2"/>
@@ -2834,11 +2800,9 @@
         <w:t xml:space="preserve">六、家长可以怎样帮忙</w:t>
       </w:r>
     </w:p>
-    <w:bookmarkEnd w:id="22"/>
-    <w:bookmarkStart w:id="39" w:name="how-you-can-help"/>
-    <w:p>
-      <w:pPr>
-        <w:pStyle w:val="Heading2"/>
+    <w:p>
+      <w:pPr>
+        <w:pStyle w:val="FirstParagraph"/>
       </w:pPr>
       <w:r>
         <w:t xml:space="preserve">6. How you can help</w:t>
@@ -2846,13 +2810,44 @@
     </w:p>
     <w:p>
       <w:pPr>
+        <w:pStyle w:val="BodyText"/>
+      </w:pPr>
+      <w:r>
+        <w:rPr>
+          <w:rFonts w:hint="eastAsia"/>
+        </w:rPr>
+        <w:t xml:space="preserve">这一节是这封信真正的目的。下面每一条都是可以在这一周就做到的具体动作，不是口号。</w:t>
+      </w:r>
+    </w:p>
+    <w:p>
+      <w:pPr>
+        <w:pStyle w:val="BodyText"/>
+      </w:pPr>
+      <w:r>
+        <w:t xml:space="preserve">This section is what the letter is for. Every item below is something you could do this week; none of them is a slogan.</w:t>
+      </w:r>
+    </w:p>
+    <w:bookmarkStart w:id="15" w:name="守住一个安静的两小时"/>
+    <w:p>
+      <w:pPr>
+        <w:pStyle w:val="Heading3"/>
+      </w:pPr>
+      <w:r>
+        <w:t xml:space="preserve">1) </w:t>
+      </w:r>
+      <w:r>
+        <w:rPr>
+          <w:rFonts w:hint="eastAsia"/>
+        </w:rPr>
+        <w:t xml:space="preserve">守住一个安静的两小时</w:t>
+      </w:r>
+    </w:p>
+    <w:p>
+      <w:pPr>
         <w:pStyle w:val="FirstParagraph"/>
       </w:pPr>
       <w:r>
-        <w:rPr>
-          <w:rFonts w:hint="eastAsia"/>
-        </w:rPr>
-        <w:t xml:space="preserve">这一节是这封信真正的目的。下面每一条都是可以在这一周就做到的具体动作，不是口号。</w:t>
+        <w:t xml:space="preserve">1) Protect a quiet two hours</w:t>
       </w:r>
     </w:p>
     <w:p>
@@ -2860,32 +2855,157 @@
         <w:pStyle w:val="BodyText"/>
       </w:pPr>
       <w:r>
-        <w:t xml:space="preserve">This section is what the letter is for. Every item below is something you could do this week; none of them is a slogan.</w:t>
-      </w:r>
-    </w:p>
-    <w:bookmarkStart w:id="23" w:name="守住一个安静的两小时"/>
+        <w:rPr>
+          <w:rFonts w:hint="eastAsia"/>
+        </w:rPr>
+        <w:t xml:space="preserve">请和孩子一起，在一周里挑出</w:t>
+      </w:r>
+      <w:r>
+        <w:rPr>
+          <w:rFonts w:hint="eastAsia"/>
+          <w:b/>
+          <w:bCs/>
+        </w:rPr>
+        <w:t xml:space="preserve">两个约一小时的固定时段</w:t>
+      </w:r>
+      <w:r>
+        <w:rPr>
+          <w:rFonts w:hint="eastAsia"/>
+        </w:rPr>
+        <w:t xml:space="preserve">（例如周三晚上、周六上午），写进家里的日历，把它当作一堂真实的课。在这两个时段里：不派家务、不安排走亲访友、不在旁边开电视。异步课程最容易被”随时都可以做”这句话吃掉——</w:t>
+      </w:r>
+      <w:r>
+        <w:rPr>
+          <w:rFonts w:hint="eastAsia"/>
+          <w:b/>
+          <w:bCs/>
+        </w:rPr>
+        <w:t xml:space="preserve">“随时”</w:t>
+      </w:r>
+      <w:r>
+        <w:rPr>
+          <w:rFonts w:hint="eastAsia"/>
+          <w:b/>
+          <w:bCs/>
+        </w:rPr>
+        <w:t xml:space="preserve">最后往往变成”没有时候”。</w:t>
+      </w:r>
+      <w:r>
+        <w:t xml:space="preserve"> </w:t>
+      </w:r>
+      <w:r>
+        <w:rPr>
+          <w:rFonts w:hint="eastAsia"/>
+        </w:rPr>
+        <w:t xml:space="preserve">时间被排进日历的孩子，和”想起来再说”的孩子，一学期下来差别非常大。</w:t>
+      </w:r>
+    </w:p>
+    <w:p>
+      <w:pPr>
+        <w:pStyle w:val="BodyText"/>
+      </w:pPr>
+      <w:r>
+        <w:t xml:space="preserve">Together with your child, pick</w:t>
+      </w:r>
+      <w:r>
+        <w:t xml:space="preserve"> </w:t>
+      </w:r>
+      <w:r>
+        <w:rPr>
+          <w:b/>
+          <w:bCs/>
+        </w:rPr>
+        <w:t xml:space="preserve">two roughly one-hour slots</w:t>
+      </w:r>
+      <w:r>
+        <w:t xml:space="preserve"> </w:t>
+      </w:r>
+      <w:r>
+        <w:t xml:space="preserve">in the week (Wednesday evening and Saturday morning, say), write them into the family calendar, and treat them as a real class. During those two hours: no errands, no visits, no television in the background. Asynchronous courses are most often eaten by the phrase</w:t>
+      </w:r>
+      <w:r>
+        <w:t xml:space="preserve"> </w:t>
+      </w:r>
+      <w:r>
+        <w:t xml:space="preserve">“you can do it anytime”</w:t>
+      </w:r>
+      <w:r>
+        <w:t xml:space="preserve"> </w:t>
+      </w:r>
+      <w:r>
+        <w:t xml:space="preserve">— and</w:t>
+      </w:r>
+      <w:r>
+        <w:t xml:space="preserve"> </w:t>
+      </w:r>
+      <w:r>
+        <w:rPr>
+          <w:b/>
+          <w:bCs/>
+        </w:rPr>
+        <w:t xml:space="preserve">“anytime”</w:t>
+      </w:r>
+      <w:r>
+        <w:rPr>
+          <w:b/>
+          <w:bCs/>
+        </w:rPr>
+        <w:t xml:space="preserve"> </w:t>
+      </w:r>
+      <w:r>
+        <w:rPr>
+          <w:b/>
+          <w:bCs/>
+        </w:rPr>
+        <w:t xml:space="preserve">tends to become</w:t>
+      </w:r>
+      <w:r>
+        <w:rPr>
+          <w:b/>
+          <w:bCs/>
+        </w:rPr>
+        <w:t xml:space="preserve"> </w:t>
+      </w:r>
+      <w:r>
+        <w:rPr>
+          <w:b/>
+          <w:bCs/>
+        </w:rPr>
+        <w:t xml:space="preserve">“no time.”</w:t>
+      </w:r>
+      <w:r>
+        <w:t xml:space="preserve"> </w:t>
+      </w:r>
+      <w:r>
+        <w:t xml:space="preserve">Over a semester, the difference between a child whose hours are on the calendar and one who works</w:t>
+      </w:r>
+      <w:r>
+        <w:t xml:space="preserve"> </w:t>
+      </w:r>
+      <w:r>
+        <w:t xml:space="preserve">“when they remember”</w:t>
+      </w:r>
+      <w:r>
+        <w:t xml:space="preserve"> </w:t>
+      </w:r>
+      <w:r>
+        <w:t xml:space="preserve">is very large.</w:t>
+      </w:r>
+    </w:p>
+    <w:bookmarkEnd w:id="15"/>
+    <w:bookmarkStart w:id="16" w:name="问过程不查答案"/>
     <w:p>
       <w:pPr>
         <w:pStyle w:val="Heading3"/>
       </w:pPr>
       <w:r>
-        <w:t xml:space="preserve">1) </w:t>
-      </w:r>
-      <w:r>
-        <w:rPr>
-          <w:rFonts w:hint="eastAsia"/>
-        </w:rPr>
-        <w:t xml:space="preserve">守住一个安静的两小时</w:t>
-      </w:r>
-    </w:p>
-    <w:bookmarkEnd w:id="23"/>
-    <w:bookmarkStart w:id="24" w:name="protect-a-quiet-two-hours"/>
-    <w:p>
-      <w:pPr>
-        <w:pStyle w:val="Heading3"/>
-      </w:pPr>
-      <w:r>
-        <w:t xml:space="preserve">1) Protect a quiet two hours</w:t>
+        <w:t xml:space="preserve">2) </w:t>
+      </w:r>
+      <w:r>
+        <w:rPr>
+          <w:rFonts w:hint="eastAsia"/>
+        </w:rPr>
+        <w:t xml:space="preserve">问过程，不查答案</w:t>
       </w:r>
     </w:p>
     <w:p>
@@ -2893,172 +3013,12 @@
         <w:pStyle w:val="FirstParagraph"/>
       </w:pPr>
       <w:r>
-        <w:rPr>
-          <w:rFonts w:hint="eastAsia"/>
-        </w:rPr>
-        <w:t xml:space="preserve">请和孩子一起，在一周里挑出</w:t>
-      </w:r>
-      <w:r>
-        <w:rPr>
-          <w:rFonts w:hint="eastAsia"/>
-          <w:b/>
-          <w:bCs/>
-        </w:rPr>
-        <w:t xml:space="preserve">两个约一小时的固定时段</w:t>
-      </w:r>
-      <w:r>
-        <w:rPr>
-          <w:rFonts w:hint="eastAsia"/>
-        </w:rPr>
-        <w:t xml:space="preserve">（例如周三晚上、周六上午），写进家里的日历，把它当作一堂真实的课。在这两个时段里：不派家务、不安排走亲访友、不在旁边开电视。异步课程最容易被”随时都可以做”这句话吃掉——</w:t>
-      </w:r>
-      <w:r>
-        <w:rPr>
-          <w:rFonts w:hint="eastAsia"/>
-          <w:b/>
-          <w:bCs/>
-        </w:rPr>
-        <w:t xml:space="preserve">“随时”</w:t>
-      </w:r>
-      <w:r>
-        <w:rPr>
-          <w:rFonts w:hint="eastAsia"/>
-          <w:b/>
-          <w:bCs/>
-        </w:rPr>
-        <w:t xml:space="preserve">最后往往变成”没有时候”。</w:t>
-      </w:r>
-      <w:r>
-        <w:t xml:space="preserve"> </w:t>
-      </w:r>
-      <w:r>
-        <w:rPr>
-          <w:rFonts w:hint="eastAsia"/>
-        </w:rPr>
-        <w:t xml:space="preserve">时间被排进日历的孩子，和”想起来再说”的孩子，一学期下来差别非常大。</w:t>
+        <w:t xml:space="preserve">2) Ask about the process; do not audit the answers</w:t>
       </w:r>
     </w:p>
     <w:p>
       <w:pPr>
         <w:pStyle w:val="BodyText"/>
-      </w:pPr>
-      <w:r>
-        <w:t xml:space="preserve">Together with your child, pick</w:t>
-      </w:r>
-      <w:r>
-        <w:t xml:space="preserve"> </w:t>
-      </w:r>
-      <w:r>
-        <w:rPr>
-          <w:b/>
-          <w:bCs/>
-        </w:rPr>
-        <w:t xml:space="preserve">two roughly one-hour slots</w:t>
-      </w:r>
-      <w:r>
-        <w:t xml:space="preserve"> </w:t>
-      </w:r>
-      <w:r>
-        <w:t xml:space="preserve">in the week (Wednesday evening and Saturday morning, say), write them into the family calendar, and treat them as a real class. During those two hours: no errands, no visits, no television in the background. Asynchronous courses are most often eaten by the phrase</w:t>
-      </w:r>
-      <w:r>
-        <w:t xml:space="preserve"> </w:t>
-      </w:r>
-      <w:r>
-        <w:t xml:space="preserve">“you can do it anytime”</w:t>
-      </w:r>
-      <w:r>
-        <w:t xml:space="preserve"> </w:t>
-      </w:r>
-      <w:r>
-        <w:t xml:space="preserve">— and</w:t>
-      </w:r>
-      <w:r>
-        <w:t xml:space="preserve"> </w:t>
-      </w:r>
-      <w:r>
-        <w:rPr>
-          <w:b/>
-          <w:bCs/>
-        </w:rPr>
-        <w:t xml:space="preserve">“anytime”</w:t>
-      </w:r>
-      <w:r>
-        <w:rPr>
-          <w:b/>
-          <w:bCs/>
-        </w:rPr>
-        <w:t xml:space="preserve"> </w:t>
-      </w:r>
-      <w:r>
-        <w:rPr>
-          <w:b/>
-          <w:bCs/>
-        </w:rPr>
-        <w:t xml:space="preserve">tends to become</w:t>
-      </w:r>
-      <w:r>
-        <w:rPr>
-          <w:b/>
-          <w:bCs/>
-        </w:rPr>
-        <w:t xml:space="preserve"> </w:t>
-      </w:r>
-      <w:r>
-        <w:rPr>
-          <w:b/>
-          <w:bCs/>
-        </w:rPr>
-        <w:t xml:space="preserve">“no time.”</w:t>
-      </w:r>
-      <w:r>
-        <w:t xml:space="preserve"> </w:t>
-      </w:r>
-      <w:r>
-        <w:t xml:space="preserve">Over a semester, the difference between a child whose hours are on the calendar and one who works</w:t>
-      </w:r>
-      <w:r>
-        <w:t xml:space="preserve"> </w:t>
-      </w:r>
-      <w:r>
-        <w:t xml:space="preserve">“when they remember”</w:t>
-      </w:r>
-      <w:r>
-        <w:t xml:space="preserve"> </w:t>
-      </w:r>
-      <w:r>
-        <w:t xml:space="preserve">is very large.</w:t>
-      </w:r>
-    </w:p>
-    <w:bookmarkEnd w:id="24"/>
-    <w:bookmarkStart w:id="25" w:name="问过程不查答案"/>
-    <w:p>
-      <w:pPr>
-        <w:pStyle w:val="Heading3"/>
-      </w:pPr>
-      <w:r>
-        <w:t xml:space="preserve">2) </w:t>
-      </w:r>
-      <w:r>
-        <w:rPr>
-          <w:rFonts w:hint="eastAsia"/>
-        </w:rPr>
-        <w:t xml:space="preserve">问过程，不查答案</w:t>
-      </w:r>
-    </w:p>
-    <w:bookmarkEnd w:id="25"/>
-    <w:bookmarkStart w:id="26" w:name="Xcfef14bb8804a03684e8b405125dac148a87323"/>
-    <w:p>
-      <w:pPr>
-        <w:pStyle w:val="Heading3"/>
-      </w:pPr>
-      <w:r>
-        <w:t xml:space="preserve">2) Ask about the process; do not audit the answers</w:t>
-      </w:r>
-    </w:p>
-    <w:p>
-      <w:pPr>
-        <w:pStyle w:val="FirstParagraph"/>
       </w:pPr>
       <w:r>
         <w:rPr>
@@ -3358,8 +3318,8 @@
         <w:t xml:space="preserve">If there is something to talk about, that is already a good conversation.</w:t>
       </w:r>
     </w:p>
-    <w:bookmarkEnd w:id="26"/>
-    <w:bookmarkStart w:id="27" w:name="孩子卡住时走这三步"/>
+    <w:bookmarkEnd w:id="16"/>
+    <w:bookmarkStart w:id="17" w:name="孩子卡住时走这三步"/>
     <w:p>
       <w:pPr>
         <w:pStyle w:val="Heading3"/>
@@ -3374,11 +3334,9 @@
         <w:t xml:space="preserve">孩子卡住时，走这三步</w:t>
       </w:r>
     </w:p>
-    <w:bookmarkEnd w:id="27"/>
-    <w:bookmarkStart w:id="28" w:name="X60fbe01ad6b6abd493f0f4fbafa1d50d3917988"/>
-    <w:p>
-      <w:pPr>
-        <w:pStyle w:val="Heading3"/>
+    <w:p>
+      <w:pPr>
+        <w:pStyle w:val="FirstParagraph"/>
       </w:pPr>
       <w:r>
         <w:t xml:space="preserve">3) When your child is stuck, follow these three steps</w:t>
@@ -3386,7 +3344,7 @@
     </w:p>
     <w:p>
       <w:pPr>
-        <w:pStyle w:val="FirstParagraph"/>
+        <w:pStyle w:val="BodyText"/>
       </w:pPr>
       <w:r>
         <w:rPr>
@@ -3611,8 +3569,8 @@
         <w:t xml:space="preserve">Contact me at once; do not wait for your child to raise it.</w:t>
       </w:r>
     </w:p>
-    <w:bookmarkEnd w:id="28"/>
-    <w:bookmarkStart w:id="29" w:name="忍住替他做的冲动"/>
+    <w:bookmarkEnd w:id="17"/>
+    <w:bookmarkStart w:id="18" w:name="忍住替他做的冲动"/>
     <w:p>
       <w:pPr>
         <w:pStyle w:val="Heading3"/>
@@ -3627,11 +3585,9 @@
         <w:t xml:space="preserve">忍住替他做的冲动</w:t>
       </w:r>
     </w:p>
-    <w:bookmarkEnd w:id="29"/>
-    <w:bookmarkStart w:id="30" w:name="resist-doing-the-work-for-them"/>
-    <w:p>
-      <w:pPr>
-        <w:pStyle w:val="Heading3"/>
+    <w:p>
+      <w:pPr>
+        <w:pStyle w:val="FirstParagraph"/>
       </w:pPr>
       <w:r>
         <w:t xml:space="preserve">4) Resist doing the work for them</w:t>
@@ -3639,7 +3595,7 @@
     </w:p>
     <w:p>
       <w:pPr>
-        <w:pStyle w:val="FirstParagraph"/>
+        <w:pStyle w:val="BodyText"/>
       </w:pPr>
       <w:r>
         <w:rPr>
@@ -3779,8 +3735,8 @@
         <w:t xml:space="preserve">).</w:t>
       </w:r>
     </w:p>
-    <w:bookmarkEnd w:id="30"/>
-    <w:bookmarkStart w:id="31" w:name="表扬过程而不是分数"/>
+    <w:bookmarkEnd w:id="18"/>
+    <w:bookmarkStart w:id="19" w:name="表扬过程而不是分数"/>
     <w:p>
       <w:pPr>
         <w:pStyle w:val="Heading3"/>
@@ -3795,14 +3751,125 @@
         <w:t xml:space="preserve">表扬过程，而不是分数</w:t>
       </w:r>
     </w:p>
-    <w:bookmarkEnd w:id="31"/>
-    <w:bookmarkStart w:id="32" w:name="celebrate-the-process-not-the-score"/>
+    <w:p>
+      <w:pPr>
+        <w:pStyle w:val="FirstParagraph"/>
+      </w:pPr>
+      <w:r>
+        <w:t xml:space="preserve">5) Celebrate the process, not the score</w:t>
+      </w:r>
+    </w:p>
+    <w:p>
+      <w:pPr>
+        <w:pStyle w:val="BodyText"/>
+      </w:pPr>
+      <w:r>
+        <w:rPr>
+          <w:rFonts w:hint="eastAsia"/>
+        </w:rPr>
+        <w:t xml:space="preserve">请把夸奖放在这些地方：</w:t>
+      </w:r>
+      <w:r>
+        <w:rPr>
+          <w:rFonts w:hint="eastAsia"/>
+        </w:rPr>
+        <w:t xml:space="preserve">“你这次换了个方法”</w:t>
+      </w:r>
+      <w:r>
+        <w:rPr>
+          <w:rFonts w:hint="eastAsia"/>
+        </w:rPr>
+        <w:t xml:space="preserve">“你把卡住的地方写下来了”</w:t>
+      </w:r>
+      <w:r>
+        <w:rPr>
+          <w:rFonts w:hint="eastAsia"/>
+        </w:rPr>
+        <w:t xml:space="preserve">“你自己给导师写了邮件”</w:t>
+      </w:r>
+      <w:r>
+        <w:rPr>
+          <w:rFonts w:hint="eastAsia"/>
+        </w:rPr>
+        <w:t xml:space="preserve">“你这周按时坐下来了”</w:t>
+      </w:r>
+      <w:r>
+        <w:rPr>
+          <w:rFonts w:hint="eastAsia"/>
+        </w:rPr>
+        <w:t xml:space="preserve">。这些都是这门课真正想培养的东西。分数会来，也会走；</w:t>
+      </w:r>
+      <w:r>
+        <w:rPr>
+          <w:rFonts w:hint="eastAsia"/>
+          <w:b/>
+          <w:bCs/>
+        </w:rPr>
+        <w:t xml:space="preserve">能自己坐下来、自己开口求助、自己调整方法的孩子，走得最远。</w:t>
+      </w:r>
+    </w:p>
+    <w:p>
+      <w:pPr>
+        <w:pStyle w:val="BodyText"/>
+      </w:pPr>
+      <w:r>
+        <w:t xml:space="preserve">Put your praise here:</w:t>
+      </w:r>
+      <w:r>
+        <w:t xml:space="preserve"> </w:t>
+      </w:r>
+      <w:r>
+        <w:t xml:space="preserve">“You tried a different method this time.”</w:t>
+      </w:r>
+      <w:r>
+        <w:t xml:space="preserve"> </w:t>
+      </w:r>
+      <w:r>
+        <w:t xml:space="preserve">“You wrote down where you got stuck.”</w:t>
+      </w:r>
+      <w:r>
+        <w:t xml:space="preserve"> </w:t>
+      </w:r>
+      <w:r>
+        <w:t xml:space="preserve">“You emailed your mentor yourself.”</w:t>
+      </w:r>
+      <w:r>
+        <w:t xml:space="preserve"> </w:t>
+      </w:r>
+      <w:r>
+        <w:t xml:space="preserve">“You sat down on time this week.”</w:t>
+      </w:r>
+      <w:r>
+        <w:t xml:space="preserve"> </w:t>
+      </w:r>
+      <w:r>
+        <w:t xml:space="preserve">These are what the course is actually trying to grow. Scores come and go;</w:t>
+      </w:r>
+      <w:r>
+        <w:t xml:space="preserve"> </w:t>
+      </w:r>
+      <w:r>
+        <w:rPr>
+          <w:b/>
+          <w:bCs/>
+        </w:rPr>
+        <w:t xml:space="preserve">the child who can sit down, ask for help, and adjust their own method goes the furthest.</w:t>
+      </w:r>
+    </w:p>
+    <w:bookmarkEnd w:id="19"/>
+    <w:bookmarkStart w:id="20" w:name="以身作则并且允许自己示弱"/>
     <w:p>
       <w:pPr>
         <w:pStyle w:val="Heading3"/>
       </w:pPr>
       <w:r>
-        <w:t xml:space="preserve">5) Celebrate the process, not the score</w:t>
+        <w:t xml:space="preserve">6) </w:t>
+      </w:r>
+      <w:r>
+        <w:rPr>
+          <w:rFonts w:hint="eastAsia"/>
+        </w:rPr>
+        <w:t xml:space="preserve">以身作则，并且允许自己示弱</w:t>
       </w:r>
     </w:p>
     <w:p>
@@ -3810,48 +3877,7 @@
         <w:pStyle w:val="FirstParagraph"/>
       </w:pPr>
       <w:r>
-        <w:rPr>
-          <w:rFonts w:hint="eastAsia"/>
-        </w:rPr>
-        <w:t xml:space="preserve">请把夸奖放在这些地方：</w:t>
-      </w:r>
-      <w:r>
-        <w:rPr>
-          <w:rFonts w:hint="eastAsia"/>
-        </w:rPr>
-        <w:t xml:space="preserve">“你这次换了个方法”</w:t>
-      </w:r>
-      <w:r>
-        <w:rPr>
-          <w:rFonts w:hint="eastAsia"/>
-        </w:rPr>
-        <w:t xml:space="preserve">“你把卡住的地方写下来了”</w:t>
-      </w:r>
-      <w:r>
-        <w:rPr>
-          <w:rFonts w:hint="eastAsia"/>
-        </w:rPr>
-        <w:t xml:space="preserve">“你自己给导师写了邮件”</w:t>
-      </w:r>
-      <w:r>
-        <w:rPr>
-          <w:rFonts w:hint="eastAsia"/>
-        </w:rPr>
-        <w:t xml:space="preserve">“你这周按时坐下来了”</w:t>
-      </w:r>
-      <w:r>
-        <w:rPr>
-          <w:rFonts w:hint="eastAsia"/>
-        </w:rPr>
-        <w:t xml:space="preserve">。这些都是这门课真正想培养的东西。分数会来，也会走；</w:t>
-      </w:r>
-      <w:r>
-        <w:rPr>
-          <w:rFonts w:hint="eastAsia"/>
-          <w:b/>
-          <w:bCs/>
-        </w:rPr>
-        <w:t xml:space="preserve">能自己坐下来、自己开口求助、自己调整方法的孩子，走得最远。</w:t>
+        <w:t xml:space="preserve">6) Model it — and allow yourself to be the learner</w:t>
       </w:r>
     </w:p>
     <w:p>
@@ -3859,73 +3885,161 @@
         <w:pStyle w:val="BodyText"/>
       </w:pPr>
       <w:r>
-        <w:t xml:space="preserve">Put your praise here:</w:t>
-      </w:r>
-      <w:r>
-        <w:t xml:space="preserve"> </w:t>
-      </w:r>
-      <w:r>
-        <w:t xml:space="preserve">“You tried a different method this time.”</w:t>
-      </w:r>
-      <w:r>
-        <w:t xml:space="preserve"> </w:t>
-      </w:r>
-      <w:r>
-        <w:t xml:space="preserve">“You wrote down where you got stuck.”</w:t>
-      </w:r>
-      <w:r>
-        <w:t xml:space="preserve"> </w:t>
-      </w:r>
-      <w:r>
-        <w:t xml:space="preserve">“You emailed your mentor yourself.”</w:t>
-      </w:r>
-      <w:r>
-        <w:t xml:space="preserve"> </w:t>
-      </w:r>
-      <w:r>
-        <w:t xml:space="preserve">“You sat down on time this week.”</w:t>
-      </w:r>
-      <w:r>
-        <w:t xml:space="preserve"> </w:t>
-      </w:r>
-      <w:r>
-        <w:t xml:space="preserve">These are what the course is actually trying to grow. Scores come and go;</w:t>
-      </w:r>
-      <w:r>
-        <w:t xml:space="preserve"> </w:t>
-      </w:r>
-      <w:r>
-        <w:rPr>
-          <w:b/>
-          <w:bCs/>
-        </w:rPr>
-        <w:t xml:space="preserve">the child who can sit down, ask for help, and adjust their own method goes the furthest.</w:t>
-      </w:r>
-    </w:p>
-    <w:bookmarkEnd w:id="32"/>
-    <w:bookmarkStart w:id="33" w:name="以身作则并且允许自己示弱"/>
+        <w:rPr>
+          <w:rFonts w:hint="eastAsia"/>
+        </w:rPr>
+        <w:t xml:space="preserve">如果不希望孩子在餐桌上看手机，最有效的一步是先把自己的手机从餐桌上拿走。反过来，也请偶尔</w:t>
+      </w:r>
+      <w:r>
+        <w:rPr>
+          <w:rFonts w:hint="eastAsia"/>
+          <w:b/>
+          <w:bCs/>
+        </w:rPr>
+        <w:t xml:space="preserve">让孩子教您一件他新学会的数字技能</w:t>
+      </w:r>
+      <w:r>
+        <w:rPr>
+          <w:rFonts w:hint="eastAsia"/>
+        </w:rPr>
+        <w:t xml:space="preserve">——怎么给截图打标注、怎么把一个网页保存下来。这件事有双重好处：他复习了，而您们之间多了一点互相信任的资本。在数码世界里，成年人并不处处强过孩子，</w:t>
+      </w:r>
+      <w:r>
+        <w:rPr>
+          <w:rFonts w:hint="eastAsia"/>
+          <w:b/>
+          <w:bCs/>
+        </w:rPr>
+        <w:t xml:space="preserve">承认这一点本身就是很好的家庭教育</w:t>
+      </w:r>
+      <w:r>
+        <w:t xml:space="preserve">。</w:t>
+      </w:r>
+    </w:p>
+    <w:p>
+      <w:pPr>
+        <w:pStyle w:val="BodyText"/>
+      </w:pPr>
+      <w:r>
+        <w:t xml:space="preserve">If you would rather your child not use a phone at the dinner table, the most effective first move is to take your own phone off it. Conversely, now and then</w:t>
+      </w:r>
+      <w:r>
+        <w:t xml:space="preserve"> </w:t>
+      </w:r>
+      <w:r>
+        <w:rPr>
+          <w:b/>
+          <w:bCs/>
+        </w:rPr>
+        <w:t xml:space="preserve">let your child teach you something they have just learned</w:t>
+      </w:r>
+      <w:r>
+        <w:t xml:space="preserve"> </w:t>
+      </w:r>
+      <w:r>
+        <w:t xml:space="preserve">— how to annotate a screenshot, how to save a web page. This does two things at once: they revise, and the two of you build a little more mutual trust. In the digital world adults are not stronger than children at every point, and</w:t>
+      </w:r>
+      <w:r>
+        <w:t xml:space="preserve"> </w:t>
+      </w:r>
+      <w:r>
+        <w:rPr>
+          <w:b/>
+          <w:bCs/>
+        </w:rPr>
+        <w:t xml:space="preserve">admitting that is itself good parenting</w:t>
+      </w:r>
+      <w:r>
+        <w:t xml:space="preserve">.</w:t>
+      </w:r>
+    </w:p>
+    <w:bookmarkEnd w:id="20"/>
+    <w:bookmarkStart w:id="21" w:name="留意反常早说早好"/>
     <w:p>
       <w:pPr>
         <w:pStyle w:val="Heading3"/>
       </w:pPr>
       <w:r>
-        <w:t xml:space="preserve">6) </w:t>
-      </w:r>
-      <w:r>
-        <w:rPr>
-          <w:rFonts w:hint="eastAsia"/>
-        </w:rPr>
-        <w:t xml:space="preserve">以身作则，并且允许自己示弱</w:t>
-      </w:r>
-    </w:p>
-    <w:bookmarkEnd w:id="33"/>
-    <w:bookmarkStart w:id="34" w:name="X5d757a834eb9d94eecf23c2543fb60100c59ac5"/>
+        <w:t xml:space="preserve">7) </w:t>
+      </w:r>
+      <w:r>
+        <w:rPr>
+          <w:rFonts w:hint="eastAsia"/>
+        </w:rPr>
+        <w:t xml:space="preserve">留意反常，早说早好</w:t>
+      </w:r>
+    </w:p>
+    <w:p>
+      <w:pPr>
+        <w:pStyle w:val="FirstParagraph"/>
+      </w:pPr>
+      <w:r>
+        <w:t xml:space="preserve">7) Watch for the unusual, and speak early</w:t>
+      </w:r>
+    </w:p>
+    <w:p>
+      <w:pPr>
+        <w:pStyle w:val="BodyText"/>
+      </w:pPr>
+      <w:r>
+        <w:rPr>
+          <w:rFonts w:hint="eastAsia"/>
+        </w:rPr>
+        <w:t xml:space="preserve">如果您注意到孩子出现明显的反常——一向开朗的孩子突然沉默；一向舍不得关电脑的孩子连续几个周末碰都不碰；一向愿意把手机放在客厅的孩子忽然断然拒绝——请不要急着下结论，也不要急着责备，</w:t>
+      </w:r>
+      <w:r>
+        <w:rPr>
+          <w:rFonts w:hint="eastAsia"/>
+          <w:b/>
+          <w:bCs/>
+        </w:rPr>
+        <w:t xml:space="preserve">先温和地问，然后尽快联系我</w:t>
+      </w:r>
+      <w:r>
+        <w:rPr>
+          <w:rFonts w:hint="eastAsia"/>
+        </w:rPr>
+        <w:t xml:space="preserve">。这几种反常，在我过去的经验里，往往指向网络上遇到的具体麻烦。信息不充足的时候贸然下结论，可能会加深孩子的伤口。</w:t>
+      </w:r>
+    </w:p>
+    <w:p>
+      <w:pPr>
+        <w:pStyle w:val="BodyText"/>
+      </w:pPr>
+      <w:r>
+        <w:t xml:space="preserve">If you notice a marked change — a cheerful child who suddenly goes quiet; a child who could never be pulled off the computer who now does not touch it for weekends on end; a child who always left their phone in the living room who now flatly refuses — do not rush to conclusions and do not rush to blame.</w:t>
+      </w:r>
+      <w:r>
+        <w:t xml:space="preserve"> </w:t>
+      </w:r>
+      <w:r>
+        <w:rPr>
+          <w:b/>
+          <w:bCs/>
+        </w:rPr>
+        <w:t xml:space="preserve">Ask gently first, then contact me promptly.</w:t>
+      </w:r>
+      <w:r>
+        <w:t xml:space="preserve"> </w:t>
+      </w:r>
+      <w:r>
+        <w:t xml:space="preserve">In my experience such changes often point to something specific that happened online. Concluding too quickly on too little information can deepen the wound.</w:t>
+      </w:r>
+    </w:p>
+    <w:bookmarkEnd w:id="21"/>
+    <w:bookmarkStart w:id="22" w:name="现在就可以开始聊家庭媒体公约"/>
     <w:p>
       <w:pPr>
         <w:pStyle w:val="Heading3"/>
       </w:pPr>
       <w:r>
-        <w:t xml:space="preserve">6) Model it — and allow yourself to be the learner</w:t>
+        <w:t xml:space="preserve">8) </w:t>
+      </w:r>
+      <w:r>
+        <w:rPr>
+          <w:rFonts w:hint="eastAsia"/>
+        </w:rPr>
+        <w:t xml:space="preserve">现在就可以开始聊”家庭媒体公约”</w:t>
       </w:r>
     </w:p>
     <w:p>
@@ -3933,190 +4047,24 @@
         <w:pStyle w:val="FirstParagraph"/>
       </w:pPr>
       <w:r>
-        <w:rPr>
-          <w:rFonts w:hint="eastAsia"/>
-        </w:rPr>
-        <w:t xml:space="preserve">如果不希望孩子在餐桌上看手机，最有效的一步是先把自己的手机从餐桌上拿走。反过来，也请偶尔</w:t>
-      </w:r>
-      <w:r>
-        <w:rPr>
-          <w:rFonts w:hint="eastAsia"/>
-          <w:b/>
-          <w:bCs/>
-        </w:rPr>
-        <w:t xml:space="preserve">让孩子教您一件他新学会的数字技能</w:t>
-      </w:r>
-      <w:r>
-        <w:rPr>
-          <w:rFonts w:hint="eastAsia"/>
-        </w:rPr>
-        <w:t xml:space="preserve">——怎么给截图打标注、怎么把一个网页保存下来。这件事有双重好处：他复习了，而您们之间多了一点互相信任的资本。在数码世界里，成年人并不处处强过孩子，</w:t>
-      </w:r>
-      <w:r>
-        <w:rPr>
-          <w:rFonts w:hint="eastAsia"/>
-          <w:b/>
-          <w:bCs/>
-        </w:rPr>
-        <w:t xml:space="preserve">承认这一点本身就是很好的家庭教育</w:t>
-      </w:r>
-      <w:r>
-        <w:t xml:space="preserve">。</w:t>
+        <w:t xml:space="preserve">8) You can start the</w:t>
+      </w:r>
+      <w:r>
+        <w:t xml:space="preserve"> </w:t>
+      </w:r>
+      <w:r>
+        <w:t xml:space="preserve">“family media agreement”</w:t>
+      </w:r>
+      <w:r>
+        <w:t xml:space="preserve"> </w:t>
+      </w:r>
+      <w:r>
+        <w:t xml:space="preserve">conversation now</w:t>
       </w:r>
     </w:p>
     <w:p>
       <w:pPr>
         <w:pStyle w:val="BodyText"/>
-      </w:pPr>
-      <w:r>
-        <w:t xml:space="preserve">If you would rather your child not use a phone at the dinner table, the most effective first move is to take your own phone off it. Conversely, now and then</w:t>
-      </w:r>
-      <w:r>
-        <w:t xml:space="preserve"> </w:t>
-      </w:r>
-      <w:r>
-        <w:rPr>
-          <w:b/>
-          <w:bCs/>
-        </w:rPr>
-        <w:t xml:space="preserve">let your child teach you something they have just learned</w:t>
-      </w:r>
-      <w:r>
-        <w:t xml:space="preserve"> </w:t>
-      </w:r>
-      <w:r>
-        <w:t xml:space="preserve">— how to annotate a screenshot, how to save a web page. This does two things at once: they revise, and the two of you build a little more mutual trust. In the digital world adults are not stronger than children at every point, and</w:t>
-      </w:r>
-      <w:r>
-        <w:t xml:space="preserve"> </w:t>
-      </w:r>
-      <w:r>
-        <w:rPr>
-          <w:b/>
-          <w:bCs/>
-        </w:rPr>
-        <w:t xml:space="preserve">admitting that is itself good parenting</w:t>
-      </w:r>
-      <w:r>
-        <w:t xml:space="preserve">.</w:t>
-      </w:r>
-    </w:p>
-    <w:bookmarkEnd w:id="34"/>
-    <w:bookmarkStart w:id="35" w:name="留意反常早说早好"/>
-    <w:p>
-      <w:pPr>
-        <w:pStyle w:val="Heading3"/>
-      </w:pPr>
-      <w:r>
-        <w:t xml:space="preserve">7) </w:t>
-      </w:r>
-      <w:r>
-        <w:rPr>
-          <w:rFonts w:hint="eastAsia"/>
-        </w:rPr>
-        <w:t xml:space="preserve">留意反常，早说早好</w:t>
-      </w:r>
-    </w:p>
-    <w:bookmarkEnd w:id="35"/>
-    <w:bookmarkStart w:id="36" w:name="watch-for-the-unusual-and-speak-early"/>
-    <w:p>
-      <w:pPr>
-        <w:pStyle w:val="Heading3"/>
-      </w:pPr>
-      <w:r>
-        <w:t xml:space="preserve">7) Watch for the unusual, and speak early</w:t>
-      </w:r>
-    </w:p>
-    <w:p>
-      <w:pPr>
-        <w:pStyle w:val="FirstParagraph"/>
-      </w:pPr>
-      <w:r>
-        <w:rPr>
-          <w:rFonts w:hint="eastAsia"/>
-        </w:rPr>
-        <w:t xml:space="preserve">如果您注意到孩子出现明显的反常——一向开朗的孩子突然沉默；一向舍不得关电脑的孩子连续几个周末碰都不碰；一向愿意把手机放在客厅的孩子忽然断然拒绝——请不要急着下结论，也不要急着责备，</w:t>
-      </w:r>
-      <w:r>
-        <w:rPr>
-          <w:rFonts w:hint="eastAsia"/>
-          <w:b/>
-          <w:bCs/>
-        </w:rPr>
-        <w:t xml:space="preserve">先温和地问，然后尽快联系我</w:t>
-      </w:r>
-      <w:r>
-        <w:rPr>
-          <w:rFonts w:hint="eastAsia"/>
-        </w:rPr>
-        <w:t xml:space="preserve">。这几种反常，在我过去的经验里，往往指向网络上遇到的具体麻烦。信息不充足的时候贸然下结论，可能会加深孩子的伤口。</w:t>
-      </w:r>
-    </w:p>
-    <w:p>
-      <w:pPr>
-        <w:pStyle w:val="BodyText"/>
-      </w:pPr>
-      <w:r>
-        <w:t xml:space="preserve">If you notice a marked change — a cheerful child who suddenly goes quiet; a child who could never be pulled off the computer who now does not touch it for weekends on end; a child who always left their phone in the living room who now flatly refuses — do not rush to conclusions and do not rush to blame.</w:t>
-      </w:r>
-      <w:r>
-        <w:t xml:space="preserve"> </w:t>
-      </w:r>
-      <w:r>
-        <w:rPr>
-          <w:b/>
-          <w:bCs/>
-        </w:rPr>
-        <w:t xml:space="preserve">Ask gently first, then contact me promptly.</w:t>
-      </w:r>
-      <w:r>
-        <w:t xml:space="preserve"> </w:t>
-      </w:r>
-      <w:r>
-        <w:t xml:space="preserve">In my experience such changes often point to something specific that happened online. Concluding too quickly on too little information can deepen the wound.</w:t>
-      </w:r>
-    </w:p>
-    <w:bookmarkEnd w:id="36"/>
-    <w:bookmarkStart w:id="37" w:name="现在就可以开始聊家庭媒体公约"/>
-    <w:p>
-      <w:pPr>
-        <w:pStyle w:val="Heading3"/>
-      </w:pPr>
-      <w:r>
-        <w:t xml:space="preserve">8) </w:t>
-      </w:r>
-      <w:r>
-        <w:rPr>
-          <w:rFonts w:hint="eastAsia"/>
-        </w:rPr>
-        <w:t xml:space="preserve">现在就可以开始聊”家庭媒体公约”</w:t>
-      </w:r>
-    </w:p>
-    <w:bookmarkEnd w:id="37"/>
-    <w:bookmarkStart w:id="38" w:name="X9ec4046c526f7023da7db2c658ca10e70b6379a"/>
-    <w:p>
-      <w:pPr>
-        <w:pStyle w:val="Heading3"/>
-      </w:pPr>
-      <w:r>
-        <w:t xml:space="preserve">8) You can start the</w:t>
-      </w:r>
-      <w:r>
-        <w:t xml:space="preserve"> </w:t>
-      </w:r>
-      <w:r>
-        <w:t xml:space="preserve">“family media agreement”</w:t>
-      </w:r>
-      <w:r>
-        <w:t xml:space="preserve"> </w:t>
-      </w:r>
-      <w:r>
-        <w:t xml:space="preserve">conversation now</w:t>
-      </w:r>
-    </w:p>
-    <w:p>
-      <w:pPr>
-        <w:pStyle w:val="FirstParagraph"/>
       </w:pPr>
       <w:r>
         <w:rPr>
@@ -4366,9 +4314,9 @@
         </w:pict>
       </w:r>
     </w:p>
-    <w:bookmarkEnd w:id="38"/>
-    <w:bookmarkEnd w:id="39"/>
-    <w:bookmarkStart w:id="40" w:name="七需要您知情的三件事"/>
+    <w:bookmarkEnd w:id="22"/>
+    <w:bookmarkEnd w:id="23"/>
+    <w:bookmarkStart w:id="24" w:name="七需要您知情的三件事"/>
     <w:p>
       <w:pPr>
         <w:pStyle w:val="Heading2"/>
@@ -4380,11 +4328,9 @@
         <w:t xml:space="preserve">七、需要您知情的三件事</w:t>
       </w:r>
     </w:p>
-    <w:bookmarkEnd w:id="40"/>
-    <w:bookmarkStart w:id="41" w:name="three-things-you-should-know-about"/>
-    <w:p>
-      <w:pPr>
-        <w:pStyle w:val="Heading2"/>
+    <w:p>
+      <w:pPr>
+        <w:pStyle w:val="FirstParagraph"/>
       </w:pPr>
       <w:r>
         <w:t xml:space="preserve">7. Three things you should know about</w:t>
@@ -4643,8 +4589,8 @@
         </w:pict>
       </w:r>
     </w:p>
-    <w:bookmarkEnd w:id="41"/>
-    <w:bookmarkStart w:id="42" w:name="八我们的三个请求"/>
+    <w:bookmarkEnd w:id="24"/>
+    <w:bookmarkStart w:id="25" w:name="八我们的三个请求"/>
     <w:p>
       <w:pPr>
         <w:pStyle w:val="Heading2"/>
@@ -4656,11 +4602,9 @@
         <w:t xml:space="preserve">八、我们的三个请求</w:t>
       </w:r>
     </w:p>
-    <w:bookmarkEnd w:id="42"/>
-    <w:bookmarkStart w:id="43" w:name="three-things-we-ask-of-you"/>
-    <w:p>
-      <w:pPr>
-        <w:pStyle w:val="Heading2"/>
+    <w:p>
+      <w:pPr>
+        <w:pStyle w:val="FirstParagraph"/>
       </w:pPr>
       <w:r>
         <w:t xml:space="preserve">8. Three things we ask of you</w:t>
@@ -4668,7 +4612,7 @@
     </w:p>
     <w:p>
       <w:pPr>
-        <w:pStyle w:val="FirstParagraph"/>
+        <w:pStyle w:val="BodyText"/>
       </w:pPr>
       <w:r>
         <w:rPr>
@@ -4860,8 +4804,8 @@
         </w:pict>
       </w:r>
     </w:p>
-    <w:bookmarkEnd w:id="43"/>
-    <w:bookmarkStart w:id="44" w:name="九有问题找谁"/>
+    <w:bookmarkEnd w:id="25"/>
+    <w:bookmarkStart w:id="26" w:name="九有问题找谁"/>
     <w:p>
       <w:pPr>
         <w:pStyle w:val="Heading2"/>
@@ -4873,11 +4817,9 @@
         <w:t xml:space="preserve">九、有问题找谁</w:t>
       </w:r>
     </w:p>
-    <w:bookmarkEnd w:id="44"/>
-    <w:bookmarkStart w:id="45" w:name="whom-to-contact"/>
-    <w:p>
-      <w:pPr>
-        <w:pStyle w:val="Heading2"/>
+    <w:p>
+      <w:pPr>
+        <w:pStyle w:val="FirstParagraph"/>
       </w:pPr>
       <w:r>
         <w:t xml:space="preserve">9. Whom to contact</w:t>
@@ -5201,8 +5143,8 @@
         </w:pict>
       </w:r>
     </w:p>
-    <w:bookmarkEnd w:id="45"/>
-    <w:bookmarkStart w:id="46" w:name="十最后"/>
+    <w:bookmarkEnd w:id="26"/>
+    <w:bookmarkStart w:id="27" w:name="十最后"/>
     <w:p>
       <w:pPr>
         <w:pStyle w:val="Heading2"/>
@@ -5214,11 +5156,9 @@
         <w:t xml:space="preserve">十、最后</w:t>
       </w:r>
     </w:p>
-    <w:bookmarkEnd w:id="46"/>
-    <w:bookmarkStart w:id="47" w:name="in-closing"/>
-    <w:p>
-      <w:pPr>
-        <w:pStyle w:val="Heading2"/>
+    <w:p>
+      <w:pPr>
+        <w:pStyle w:val="FirstParagraph"/>
       </w:pPr>
       <w:r>
         <w:t xml:space="preserve">10. In closing</w:t>
@@ -5226,7 +5166,7 @@
     </w:p>
     <w:p>
       <w:pPr>
-        <w:pStyle w:val="FirstParagraph"/>
+        <w:pStyle w:val="BodyText"/>
       </w:pPr>
       <w:r>
         <w:rPr>
@@ -5450,8 +5390,7 @@
         </w:pict>
       </w:r>
     </w:p>
-    <w:bookmarkEnd w:id="47"/>
-    <w:bookmarkEnd w:id="48"/>
+    <w:bookmarkEnd w:id="27"/>
     <w:sectPr>
       <w:footnotePr>
         <w:numRestart w:val="eachSect"/>

</xml_diff>

<commit_message>
Curriculum maps join the front page; research promises untangle from teaching
- Semester 1 map sits above the module schedule; Semester 2 map follows
  the schedule with a "under construction" note. Wide maps scroll in
  their own container on small screens.
- The parents letter now scopes the browser-only promise to the ON-PAGE
  self-checks and points any consent-requiring questionnaire to its own
  information letter and reply slip — matching ShiFu's ruling that the
  research instrument is administered in school only and never appears
  on the site. Both languages updated in step; all outputs rebuilt.

(The consent pack, ruled decision sheet, and Year Plan §9 update live
in the project folder, outside this repo.)
</commit_message>
<xml_diff>
--- a/resources/letter-to-parents-editable.docx
+++ b/resources/letter-to-parents-editable.docx
@@ -1295,21 +1295,21 @@
         <w:rPr>
           <w:rFonts w:hint="eastAsia"/>
         </w:rPr>
-        <w:t xml:space="preserve">课程中还有几次</w:t>
-      </w:r>
-      <w:r>
-        <w:rPr>
-          <w:rFonts w:hint="eastAsia"/>
-          <w:b/>
-          <w:bCs/>
-        </w:rPr>
-        <w:t xml:space="preserve">不计分的”学习自检”</w:t>
-      </w:r>
-      <w:r>
-        <w:rPr>
-          <w:rFonts w:hint="eastAsia"/>
-        </w:rPr>
-        <w:t xml:space="preserve">，帮孩子看清自己的变化。它不进成绩，不影响证书，结果只显示在孩子自己的浏览器里。</w:t>
+        <w:t xml:space="preserve">课程网页上还有几次</w:t>
+      </w:r>
+      <w:r>
+        <w:rPr>
+          <w:rFonts w:hint="eastAsia"/>
+          <w:b/>
+          <w:bCs/>
+        </w:rPr>
+        <w:t xml:space="preserve">不计分的”学习状态自测”</w:t>
+      </w:r>
+      <w:r>
+        <w:rPr>
+          <w:rFonts w:hint="eastAsia"/>
+        </w:rPr>
+        <w:t xml:space="preserve">，帮孩子看清自己的变化。它不进成绩，不影响证书，结果只显示在孩子自己的浏览器里，我们不收集。（若学校另行开展需要家长同意的问卷，会以单独的告知信与回执征求您的意见，与课程网页无关。）</w:t>
       </w:r>
     </w:p>
     <w:p>
@@ -3321,7 +3321,7 @@
         <w:pStyle w:val="BodyText"/>
       </w:pPr>
       <w:r>
-        <w:t xml:space="preserve">The course also includes a few</w:t>
+        <w:t xml:space="preserve">The course pages also include a few</w:t>
       </w:r>
       <w:r>
         <w:t xml:space="preserve"> </w:t>
@@ -3348,7 +3348,7 @@
         <w:t xml:space="preserve">“learning self-checks”</w:t>
       </w:r>
       <w:r>
-        <w:t xml:space="preserve">. They never enter the grade, never affect the certificate, and display only in your child’s own browser.</w:t>
+        <w:t xml:space="preserve">. They never enter the grade, never affect the certificate, and display only in your child’s own browser — we collect nothing. (Should the school ever run a questionnaire that needs parental consent, we will ask you separately, with its own information letter and reply slip; it is unrelated to the course pages.)</w:t>
       </w:r>
     </w:p>
     <w:p>

</xml_diff>

<commit_message>
Paper editions become formal documents; maps and the site URL ride along
Per ShiFu: the parents letter no longer says "no signature needed" —
research consent forms WILL ask for signatures, and the sentence would
have confused the two papers. Print typography reworked for formality:
11pt body on document-scale section spacing, the contents list sharing
its page with the opening instead of commanding its own, narrow label
columns in info tables, 22/20mm margins. Each PDF ends with a full
landscape page carrying the curriculum map (S1 for parents and the
handbook, the year map for administrators) captioned with the live
course URL, which also replaces the URL fill-in fields now that the
site is published. Fixed en route: the three-models table header lost
its A/B/C labels in the Chinese part because the cells began with
Latin letters — they now begin 方式 A/B/C and survive the split.
Page counts: parents 10+1, administrators 13+1, handbook 28+1.
</commit_message>
<xml_diff>
--- a/resources/letter-to-parents-editable.docx
+++ b/resources/letter-to-parents-editable.docx
@@ -122,7 +122,7 @@
         <w:rPr>
           <w:rFonts w:hint="eastAsia"/>
         </w:rPr>
-        <w:t xml:space="preserve">不用回复，也不用签字。读完约五分钟。</w:t>
+        <w:t xml:space="preserve">这封信不需要您回复。读完约五分钟。</w:t>
       </w:r>
       <w:r>
         <w:rPr>
@@ -2099,22 +2099,7 @@
               <w:pStyle w:val="Compact"/>
             </w:pPr>
             <w:r>
-              <w:rPr>
-                <w:rFonts w:hint="eastAsia"/>
-              </w:rPr>
-              <w:t xml:space="preserve">【请填写</w:t>
-            </w:r>
-            <w:r>
-              <w:t xml:space="preserve"> Fill </w:t>
-            </w:r>
-            <w:r>
-              <w:rPr>
-                <w:rFonts w:hint="eastAsia"/>
-              </w:rPr>
-              <w:t xml:space="preserve">in：课程网址</w:t>
-            </w:r>
-            <w:r>
-              <w:t xml:space="preserve"> course site URL】</w:t>
+              <w:t xml:space="preserve">https://yupei2023.github.io/digital-learning/</w:t>
             </w:r>
           </w:p>
         </w:tc>
@@ -2373,7 +2358,7 @@
         <w:pStyle w:val="BodyText"/>
       </w:pPr>
       <w:r>
-        <w:t xml:space="preserve">No reply and no signature needed. It takes about five minutes to read.</w:t>
+        <w:t xml:space="preserve">This letter needs no reply. It takes about five minutes to read.</w:t>
       </w:r>
       <w:r>
         <w:t xml:space="preserve"> </w:t>
@@ -3924,22 +3909,7 @@
               <w:pStyle w:val="Compact"/>
             </w:pPr>
             <w:r>
-              <w:rPr>
-                <w:rFonts w:hint="eastAsia"/>
-              </w:rPr>
-              <w:t xml:space="preserve">【请填写</w:t>
-            </w:r>
-            <w:r>
-              <w:t xml:space="preserve"> Fill </w:t>
-            </w:r>
-            <w:r>
-              <w:rPr>
-                <w:rFonts w:hint="eastAsia"/>
-              </w:rPr>
-              <w:t xml:space="preserve">in：课程网址</w:t>
-            </w:r>
-            <w:r>
-              <w:t xml:space="preserve"> course site URL】</w:t>
+              <w:t xml:space="preserve">https://yupei2023.github.io/digital-learning/</w:t>
             </w:r>
           </w:p>
         </w:tc>

</xml_diff>